<commit_message>
added image from local resident
</commit_message>
<xml_diff>
--- a/2_Full_Draft_S&SE Asia special issue- The danger we delete.docx
+++ b/2_Full_Draft_S&SE Asia special issue- The danger we delete.docx
@@ -37,7 +37,6 @@
           <w:szCs w:val="28"/>
         </w:rPr>
       </w:pPr>
-      <w:proofErr w:type="gramStart"/>
       <w:r>
         <w:rPr>
           <w:rFonts w:ascii="Times New Roman" w:hAnsi="Times New Roman" w:cs="Times New Roman"/>
@@ -46,10 +45,13 @@
           <w:sz w:val="28"/>
           <w:szCs w:val="28"/>
         </w:rPr>
-        <w:t>Significance</w:t>
-      </w:r>
-      <w:proofErr w:type="gramEnd"/>
-      <w:r>
+        <w:t>Significance special issue on South and South-East Asia</w:t>
+      </w:r>
+    </w:p>
+    <w:p>
+      <w:pPr>
+        <w:spacing w:after="0"/>
+        <w:jc w:val="center"/>
         <w:rPr>
           <w:rFonts w:ascii="Times New Roman" w:hAnsi="Times New Roman" w:cs="Times New Roman"/>
           <w:b/>
@@ -57,42 +59,6 @@
           <w:sz w:val="28"/>
           <w:szCs w:val="28"/>
         </w:rPr>
-        <w:t xml:space="preserve"> special </w:t>
-      </w:r>
-      <w:proofErr w:type="gramStart"/>
-      <w:r>
-        <w:rPr>
-          <w:rFonts w:ascii="Times New Roman" w:hAnsi="Times New Roman" w:cs="Times New Roman"/>
-          <w:b/>
-          <w:bCs/>
-          <w:sz w:val="28"/>
-          <w:szCs w:val="28"/>
-        </w:rPr>
-        <w:t>issue</w:t>
-      </w:r>
-      <w:proofErr w:type="gramEnd"/>
-      <w:r>
-        <w:rPr>
-          <w:rFonts w:ascii="Times New Roman" w:hAnsi="Times New Roman" w:cs="Times New Roman"/>
-          <w:b/>
-          <w:bCs/>
-          <w:sz w:val="28"/>
-          <w:szCs w:val="28"/>
-        </w:rPr>
-        <w:t xml:space="preserve"> on South and South-East Asia</w:t>
-      </w:r>
-    </w:p>
-    <w:p>
-      <w:pPr>
-        <w:spacing w:after="0"/>
-        <w:jc w:val="center"/>
-        <w:rPr>
-          <w:rFonts w:ascii="Times New Roman" w:hAnsi="Times New Roman" w:cs="Times New Roman"/>
-          <w:b/>
-          <w:bCs/>
-          <w:sz w:val="28"/>
-          <w:szCs w:val="28"/>
-        </w:rPr>
       </w:pPr>
     </w:p>
     <w:p>
@@ -138,29 +104,7 @@
           <w:sz w:val="32"/>
           <w:szCs w:val="32"/>
         </w:rPr>
-        <w:t xml:space="preserve">Rethinking flood warnings after the </w:t>
-      </w:r>
-      <w:proofErr w:type="spellStart"/>
-      <w:r>
-        <w:rPr>
-          <w:rFonts w:ascii="Times New Roman" w:hAnsi="Times New Roman" w:cs="Times New Roman"/>
-          <w:b/>
-          <w:bCs/>
-          <w:sz w:val="32"/>
-          <w:szCs w:val="32"/>
-        </w:rPr>
-        <w:t>Ditwah</w:t>
-      </w:r>
-      <w:proofErr w:type="spellEnd"/>
-      <w:r>
-        <w:rPr>
-          <w:rFonts w:ascii="Times New Roman" w:hAnsi="Times New Roman" w:cs="Times New Roman"/>
-          <w:b/>
-          <w:bCs/>
-          <w:sz w:val="32"/>
-          <w:szCs w:val="32"/>
-        </w:rPr>
-        <w:t xml:space="preserve"> Cyclone and devastating floods in Sri Lanka</w:t>
+        <w:t>Rethinking flood warnings after the Ditwah Cyclone and devastating floods in Sri Lanka</w:t>
       </w:r>
     </w:p>
     <w:p>
@@ -230,6 +174,101 @@
     <w:p>
       <w:pPr>
         <w:spacing w:before="120" w:after="120"/>
+        <w:jc w:val="center"/>
+        <w:rPr>
+          <w:noProof/>
+        </w:rPr>
+      </w:pPr>
+      <w:r>
+        <w:rPr>
+          <w:noProof/>
+        </w:rPr>
+        <w:drawing>
+          <wp:inline distT="0" distB="0" distL="0" distR="0" wp14:anchorId="6FC78C1D" wp14:editId="6483B5B5">
+            <wp:extent cx="5731510" cy="3054350"/>
+            <wp:effectExtent l="0" t="0" r="2540" b="0"/>
+            <wp:docPr id="1041918478" name="Picture 3"/>
+            <wp:cNvGraphicFramePr>
+              <a:graphicFrameLocks xmlns:a="http://schemas.openxmlformats.org/drawingml/2006/main" noChangeAspect="1"/>
+            </wp:cNvGraphicFramePr>
+            <a:graphic xmlns:a="http://schemas.openxmlformats.org/drawingml/2006/main">
+              <a:graphicData uri="http://schemas.openxmlformats.org/drawingml/2006/picture">
+                <pic:pic xmlns:pic="http://schemas.openxmlformats.org/drawingml/2006/picture">
+                  <pic:nvPicPr>
+                    <pic:cNvPr id="0" name="Picture 6"/>
+                    <pic:cNvPicPr>
+                      <a:picLocks noChangeAspect="1" noChangeArrowheads="1"/>
+                    </pic:cNvPicPr>
+                  </pic:nvPicPr>
+                  <pic:blipFill>
+                    <a:blip r:embed="rId9">
+                      <a:extLst>
+                        <a:ext uri="{28A0092B-C50C-407E-A947-70E740481C1C}">
+                          <a14:useLocalDpi xmlns:a14="http://schemas.microsoft.com/office/drawing/2010/main" val="0"/>
+                        </a:ext>
+                      </a:extLst>
+                    </a:blip>
+                    <a:srcRect/>
+                    <a:stretch>
+                      <a:fillRect/>
+                    </a:stretch>
+                  </pic:blipFill>
+                  <pic:spPr bwMode="auto">
+                    <a:xfrm>
+                      <a:off x="0" y="0"/>
+                      <a:ext cx="5731510" cy="3054350"/>
+                    </a:xfrm>
+                    <a:prstGeom prst="rect">
+                      <a:avLst/>
+                    </a:prstGeom>
+                    <a:noFill/>
+                    <a:ln>
+                      <a:noFill/>
+                    </a:ln>
+                  </pic:spPr>
+                </pic:pic>
+              </a:graphicData>
+            </a:graphic>
+          </wp:inline>
+        </w:drawing>
+      </w:r>
+    </w:p>
+    <w:p>
+      <w:pPr>
+        <w:spacing w:before="120" w:after="120"/>
+        <w:jc w:val="center"/>
+        <w:rPr>
+          <w:rFonts w:ascii="Times New Roman" w:hAnsi="Times New Roman" w:cs="Times New Roman"/>
+        </w:rPr>
+      </w:pPr>
+      <w:r>
+        <w:rPr>
+          <w:rFonts w:ascii="Times New Roman" w:hAnsi="Times New Roman" w:cs="Times New Roman"/>
+        </w:rPr>
+        <w:t xml:space="preserve">Figure 1: </w:t>
+      </w:r>
+      <w:r>
+        <w:rPr>
+          <w:rFonts w:ascii="Times New Roman" w:hAnsi="Times New Roman" w:cs="Times New Roman"/>
+        </w:rPr>
+        <w:t>Area affected by flooding in the Kelani River basin following Cyclone Ditwah (November 2025), where rising floodwaters disrupted daily life.</w:t>
+      </w:r>
+      <w:r>
+        <w:rPr>
+          <w:rFonts w:ascii="Times New Roman" w:hAnsi="Times New Roman" w:cs="Times New Roman"/>
+        </w:rPr>
+        <w:t xml:space="preserve"> </w:t>
+      </w:r>
+      <w:r>
+        <w:rPr>
+          <w:rFonts w:ascii="Times New Roman" w:hAnsi="Times New Roman" w:cs="Times New Roman"/>
+        </w:rPr>
+        <w:t>Photo credit: Local residents in the area</w:t>
+      </w:r>
+    </w:p>
+    <w:p>
+      <w:pPr>
+        <w:spacing w:before="120" w:after="120"/>
         <w:jc w:val="both"/>
         <w:rPr>
           <w:rFonts w:ascii="Times New Roman" w:hAnsi="Times New Roman" w:cs="Times New Roman"/>
@@ -237,25 +276,252 @@
       </w:pPr>
       <w:r>
         <w:rPr>
+          <w:rFonts w:ascii="Times New Roman" w:hAnsi="Times New Roman" w:cs="Times New Roman"/>
+        </w:rPr>
+        <w:t>Unusual observations</w:t>
+      </w:r>
+      <w:r>
+        <w:rPr>
+          <w:rFonts w:ascii="Times New Roman" w:hAnsi="Times New Roman" w:cs="Times New Roman"/>
+        </w:rPr>
+        <w:t xml:space="preserve"> </w:t>
+      </w:r>
+      <w:r>
+        <w:rPr>
+          <w:rFonts w:ascii="Times New Roman" w:hAnsi="Times New Roman" w:cs="Times New Roman"/>
+        </w:rPr>
+        <w:t>in data usually s</w:t>
+      </w:r>
+      <w:r>
+        <w:rPr>
+          <w:rFonts w:ascii="Times New Roman" w:hAnsi="Times New Roman" w:cs="Times New Roman"/>
+        </w:rPr>
+        <w:t xml:space="preserve">peak </w:t>
+      </w:r>
+      <w:r>
+        <w:rPr>
+          <w:rFonts w:ascii="Times New Roman" w:hAnsi="Times New Roman" w:cs="Times New Roman"/>
+        </w:rPr>
+        <w:t>f</w:t>
+      </w:r>
+      <w:r>
+        <w:rPr>
+          <w:rFonts w:ascii="Times New Roman" w:hAnsi="Times New Roman" w:cs="Times New Roman"/>
+        </w:rPr>
+        <w:t>irs</w:t>
+      </w:r>
+      <w:r>
+        <w:rPr>
+          <w:rFonts w:ascii="Times New Roman" w:hAnsi="Times New Roman" w:cs="Times New Roman"/>
+        </w:rPr>
+        <w:t xml:space="preserve">t. </w:t>
+      </w:r>
+      <w:r>
+        <w:rPr>
+          <w:rFonts w:ascii="Times New Roman" w:hAnsi="Times New Roman" w:cs="Times New Roman"/>
+        </w:rPr>
+        <w:t xml:space="preserve">Disasters </w:t>
+      </w:r>
+      <w:r>
+        <w:rPr>
+          <w:rFonts w:ascii="Times New Roman" w:hAnsi="Times New Roman" w:cs="Times New Roman"/>
+        </w:rPr>
+        <w:t>f</w:t>
+      </w:r>
+      <w:r>
+        <w:rPr>
+          <w:rFonts w:ascii="Times New Roman" w:hAnsi="Times New Roman" w:cs="Times New Roman"/>
+        </w:rPr>
+        <w:t xml:space="preserve">ollow </w:t>
+      </w:r>
+      <w:r>
+        <w:rPr>
+          <w:rFonts w:ascii="Times New Roman" w:hAnsi="Times New Roman" w:cs="Times New Roman"/>
+        </w:rPr>
+        <w:t>o</w:t>
+      </w:r>
+      <w:r>
+        <w:rPr>
+          <w:rFonts w:ascii="Times New Roman" w:hAnsi="Times New Roman" w:cs="Times New Roman"/>
+        </w:rPr>
+        <w:t xml:space="preserve">nly </w:t>
+      </w:r>
+      <w:r>
+        <w:rPr>
+          <w:rFonts w:ascii="Times New Roman" w:hAnsi="Times New Roman" w:cs="Times New Roman"/>
+        </w:rPr>
+        <w:t>i</w:t>
+      </w:r>
+      <w:r>
+        <w:rPr>
+          <w:rFonts w:ascii="Times New Roman" w:hAnsi="Times New Roman" w:cs="Times New Roman"/>
+        </w:rPr>
+        <w:t xml:space="preserve">f </w:t>
+      </w:r>
+      <w:r>
+        <w:rPr>
+          <w:rFonts w:ascii="Times New Roman" w:hAnsi="Times New Roman" w:cs="Times New Roman"/>
+        </w:rPr>
+        <w:t>w</w:t>
+      </w:r>
+      <w:r>
+        <w:rPr>
+          <w:rFonts w:ascii="Times New Roman" w:hAnsi="Times New Roman" w:cs="Times New Roman"/>
+        </w:rPr>
+        <w:t xml:space="preserve">e </w:t>
+      </w:r>
+      <w:r>
+        <w:rPr>
+          <w:rFonts w:ascii="Times New Roman" w:hAnsi="Times New Roman" w:cs="Times New Roman"/>
+        </w:rPr>
+        <w:t>i</w:t>
+      </w:r>
+      <w:r>
+        <w:rPr>
+          <w:rFonts w:ascii="Times New Roman" w:hAnsi="Times New Roman" w:cs="Times New Roman"/>
+        </w:rPr>
+        <w:t xml:space="preserve">gnore </w:t>
+      </w:r>
+      <w:r>
+        <w:rPr>
+          <w:rFonts w:ascii="Times New Roman" w:hAnsi="Times New Roman" w:cs="Times New Roman"/>
+        </w:rPr>
+        <w:t>t</w:t>
+      </w:r>
+      <w:r>
+        <w:rPr>
+          <w:rFonts w:ascii="Times New Roman" w:hAnsi="Times New Roman" w:cs="Times New Roman"/>
+        </w:rPr>
+        <w:t>hem</w:t>
+      </w:r>
+      <w:r>
+        <w:rPr>
+          <w:rFonts w:ascii="Times New Roman" w:hAnsi="Times New Roman" w:cs="Times New Roman"/>
+        </w:rPr>
+        <w:t xml:space="preserve">. </w:t>
+      </w:r>
+      <w:r>
+        <w:rPr>
+          <w:rFonts w:ascii="Times New Roman" w:hAnsi="Times New Roman" w:cs="Times New Roman"/>
+        </w:rPr>
+        <w:t xml:space="preserve">In most data modeling workflows, we start the modeling process with the </w:t>
+      </w:r>
+      <w:r>
+        <w:rPr>
+          <w:rFonts w:ascii="Times New Roman" w:hAnsi="Times New Roman" w:cs="Times New Roman"/>
+        </w:rPr>
+        <w:t>preprocessing</w:t>
+      </w:r>
+      <w:r>
+        <w:rPr>
+          <w:rFonts w:ascii="Times New Roman" w:hAnsi="Times New Roman" w:cs="Times New Roman"/>
+        </w:rPr>
+        <w:t xml:space="preserve"> step, where unusual observations, also known as outliers or anomalies, are detected and often deleted</w:t>
+      </w:r>
+      <w:r>
+        <w:rPr>
+          <w:rFonts w:ascii="Times New Roman" w:hAnsi="Times New Roman" w:cs="Times New Roman"/>
+        </w:rPr>
+        <w:t xml:space="preserve"> or ignored</w:t>
+      </w:r>
+      <w:r>
+        <w:rPr>
+          <w:rFonts w:ascii="Times New Roman" w:hAnsi="Times New Roman" w:cs="Times New Roman"/>
+        </w:rPr>
+        <w:t xml:space="preserve"> to avoid biased estimates, misspecified models, misleading results, and poor decisions. Yet in some cases, these unusual observations can be the main carriers of vital information and identifying them, instead of deleting them, should be the central goal of the modeling process.</w:t>
+      </w:r>
+      <w:r>
+        <w:rPr>
+          <w:rFonts w:ascii="Times New Roman" w:hAnsi="Times New Roman" w:cs="Times New Roman"/>
+        </w:rPr>
+        <w:t xml:space="preserve"> </w:t>
+      </w:r>
+      <w:r>
+        <w:rPr>
+          <w:rFonts w:ascii="Times New Roman" w:hAnsi="Times New Roman" w:cs="Times New Roman"/>
+        </w:rPr>
+        <w:t>Extreme weather conditions such as cyclones and floods are a clear example of this reality</w:t>
+      </w:r>
+      <w:r>
+        <w:rPr>
+          <w:rFonts w:ascii="Times New Roman" w:hAnsi="Times New Roman" w:cs="Times New Roman"/>
+          <w:b/>
+          <w:bCs/>
+        </w:rPr>
+        <w:t>.</w:t>
+      </w:r>
+    </w:p>
+    <w:p>
+      <w:pPr>
+        <w:spacing w:before="120" w:after="120"/>
+        <w:jc w:val="center"/>
+        <w:rPr>
+          <w:rFonts w:ascii="Times New Roman" w:hAnsi="Times New Roman" w:cs="Times New Roman"/>
+          <w:i/>
+          <w:iCs/>
+          <w:sz w:val="32"/>
+          <w:szCs w:val="32"/>
+        </w:rPr>
+      </w:pPr>
+      <w:r>
+        <w:rPr>
+          <w:rFonts w:ascii="Times New Roman" w:hAnsi="Times New Roman" w:cs="Times New Roman"/>
+          <w:sz w:val="32"/>
+          <w:szCs w:val="32"/>
+        </w:rPr>
+        <w:t>“</w:t>
+      </w:r>
+      <w:r>
+        <w:rPr>
+          <w:rFonts w:ascii="Times New Roman" w:hAnsi="Times New Roman" w:cs="Times New Roman"/>
+          <w:i/>
+          <w:iCs/>
+          <w:sz w:val="32"/>
+          <w:szCs w:val="32"/>
+        </w:rPr>
+        <w:t>Unusual observations</w:t>
+      </w:r>
+      <w:r>
+        <w:rPr>
+          <w:rFonts w:ascii="Times New Roman" w:hAnsi="Times New Roman" w:cs="Times New Roman"/>
+          <w:i/>
+          <w:iCs/>
+          <w:sz w:val="32"/>
+          <w:szCs w:val="32"/>
+        </w:rPr>
+        <w:t xml:space="preserve"> in data speak first. Disasters follow only if we ignore them.”</w:t>
+      </w:r>
+    </w:p>
+    <w:p>
+      <w:pPr>
+        <w:spacing w:before="120" w:after="120"/>
+        <w:jc w:val="both"/>
+        <w:rPr>
+          <w:rFonts w:ascii="Times New Roman" w:hAnsi="Times New Roman" w:cs="Times New Roman"/>
+        </w:rPr>
+      </w:pPr>
+      <w:r>
+        <w:rPr>
           <w:noProof/>
         </w:rPr>
+        <w:lastRenderedPageBreak/>
         <w:drawing>
-          <wp:anchor distT="0" distB="0" distL="114300" distR="114300" simplePos="0" relativeHeight="251667456" behindDoc="0" locked="0" layoutInCell="1" allowOverlap="1" wp14:anchorId="1C1499D7" wp14:editId="61B7C293">
+          <wp:anchor distT="0" distB="0" distL="114300" distR="114300" simplePos="0" relativeHeight="251671552" behindDoc="0" locked="0" layoutInCell="1" allowOverlap="1" wp14:anchorId="6DBF2592" wp14:editId="28CD3A42">
             <wp:simplePos x="0" y="0"/>
             <wp:positionH relativeFrom="margin">
-              <wp:posOffset>687246</wp:posOffset>
+              <wp:posOffset>106045</wp:posOffset>
             </wp:positionH>
             <wp:positionV relativeFrom="paragraph">
-              <wp:posOffset>9651</wp:posOffset>
+              <wp:posOffset>213995</wp:posOffset>
             </wp:positionV>
-            <wp:extent cx="4128135" cy="5467985"/>
-            <wp:effectExtent l="0" t="0" r="5715" b="0"/>
+            <wp:extent cx="2511425" cy="3326765"/>
+            <wp:effectExtent l="0" t="0" r="3175" b="6985"/>
             <wp:wrapThrough wrapText="bothSides">
               <wp:wrapPolygon edited="0">
                 <wp:start x="0" y="0"/>
                 <wp:lineTo x="0" y="21522"/>
-                <wp:lineTo x="21530" y="21522"/>
-                <wp:lineTo x="21530" y="0"/>
+                <wp:lineTo x="21463" y="21522"/>
+                <wp:lineTo x="21463" y="0"/>
                 <wp:lineTo x="0" y="0"/>
               </wp:wrapPolygon>
             </wp:wrapThrough>
@@ -273,7 +539,7 @@
                     </pic:cNvPicPr>
                   </pic:nvPicPr>
                   <pic:blipFill>
-                    <a:blip r:embed="rId9" cstate="print">
+                    <a:blip r:embed="rId10" cstate="print">
                       <a:extLst>
                         <a:ext uri="{28A0092B-C50C-407E-A947-70E740481C1C}">
                           <a14:useLocalDpi xmlns:a14="http://schemas.microsoft.com/office/drawing/2010/main" val="0"/>
@@ -288,7 +554,7 @@
                   <pic:spPr bwMode="auto">
                     <a:xfrm>
                       <a:off x="0" y="0"/>
-                      <a:ext cx="4128135" cy="5467985"/>
+                      <a:ext cx="2511425" cy="3326765"/>
                     </a:xfrm>
                     <a:prstGeom prst="rect">
                       <a:avLst/>
@@ -310,491 +576,27 @@
           </wp:anchor>
         </w:drawing>
       </w:r>
-    </w:p>
-    <w:p>
-      <w:pPr>
-        <w:spacing w:before="120" w:after="120"/>
-        <w:jc w:val="both"/>
-        <w:rPr>
-          <w:rFonts w:ascii="Times New Roman" w:hAnsi="Times New Roman" w:cs="Times New Roman"/>
-        </w:rPr>
-      </w:pPr>
-    </w:p>
-    <w:p>
-      <w:pPr>
-        <w:spacing w:before="120" w:after="120"/>
-        <w:jc w:val="both"/>
-        <w:rPr>
-          <w:rFonts w:ascii="Times New Roman" w:hAnsi="Times New Roman" w:cs="Times New Roman"/>
-        </w:rPr>
-      </w:pPr>
-    </w:p>
-    <w:p>
-      <w:pPr>
-        <w:spacing w:before="120" w:after="120"/>
-        <w:jc w:val="both"/>
-        <w:rPr>
-          <w:rFonts w:ascii="Times New Roman" w:hAnsi="Times New Roman" w:cs="Times New Roman"/>
-        </w:rPr>
-      </w:pPr>
-    </w:p>
-    <w:p>
-      <w:pPr>
-        <w:spacing w:before="120" w:after="120"/>
-        <w:jc w:val="both"/>
-        <w:rPr>
-          <w:rFonts w:ascii="Times New Roman" w:hAnsi="Times New Roman" w:cs="Times New Roman"/>
-        </w:rPr>
-      </w:pPr>
-    </w:p>
-    <w:p>
-      <w:pPr>
-        <w:spacing w:before="120" w:after="120"/>
-        <w:jc w:val="both"/>
-        <w:rPr>
-          <w:rFonts w:ascii="Times New Roman" w:hAnsi="Times New Roman" w:cs="Times New Roman"/>
-        </w:rPr>
-      </w:pPr>
-    </w:p>
-    <w:p>
-      <w:pPr>
-        <w:spacing w:before="120" w:after="120"/>
-        <w:jc w:val="both"/>
-        <w:rPr>
-          <w:rFonts w:ascii="Times New Roman" w:hAnsi="Times New Roman" w:cs="Times New Roman"/>
-        </w:rPr>
-      </w:pPr>
-    </w:p>
-    <w:p>
-      <w:pPr>
-        <w:spacing w:before="120" w:after="120"/>
-        <w:jc w:val="both"/>
-        <w:rPr>
-          <w:rFonts w:ascii="Times New Roman" w:hAnsi="Times New Roman" w:cs="Times New Roman"/>
-        </w:rPr>
-      </w:pPr>
-    </w:p>
-    <w:p>
-      <w:pPr>
-        <w:spacing w:before="120" w:after="120"/>
-        <w:jc w:val="both"/>
-        <w:rPr>
-          <w:rFonts w:ascii="Times New Roman" w:hAnsi="Times New Roman" w:cs="Times New Roman"/>
-        </w:rPr>
-      </w:pPr>
-    </w:p>
-    <w:p>
-      <w:pPr>
-        <w:spacing w:before="120" w:after="120"/>
-        <w:jc w:val="both"/>
-        <w:rPr>
-          <w:rFonts w:ascii="Times New Roman" w:hAnsi="Times New Roman" w:cs="Times New Roman"/>
-        </w:rPr>
-      </w:pPr>
-    </w:p>
-    <w:p>
-      <w:pPr>
-        <w:spacing w:before="120" w:after="120"/>
-        <w:jc w:val="both"/>
-        <w:rPr>
-          <w:rFonts w:ascii="Times New Roman" w:hAnsi="Times New Roman" w:cs="Times New Roman"/>
-        </w:rPr>
-      </w:pPr>
-    </w:p>
-    <w:p>
-      <w:pPr>
-        <w:spacing w:before="120" w:after="120"/>
-        <w:jc w:val="both"/>
-        <w:rPr>
-          <w:rFonts w:ascii="Times New Roman" w:hAnsi="Times New Roman" w:cs="Times New Roman"/>
-        </w:rPr>
-      </w:pPr>
-    </w:p>
-    <w:p>
-      <w:pPr>
-        <w:spacing w:before="120" w:after="120"/>
-        <w:jc w:val="both"/>
-        <w:rPr>
-          <w:rFonts w:ascii="Times New Roman" w:hAnsi="Times New Roman" w:cs="Times New Roman"/>
-        </w:rPr>
-      </w:pPr>
-    </w:p>
-    <w:p>
-      <w:pPr>
-        <w:spacing w:before="120" w:after="120"/>
-        <w:jc w:val="both"/>
-        <w:rPr>
-          <w:rFonts w:ascii="Times New Roman" w:hAnsi="Times New Roman" w:cs="Times New Roman"/>
-        </w:rPr>
-      </w:pPr>
-    </w:p>
-    <w:p>
-      <w:pPr>
-        <w:spacing w:before="120" w:after="120"/>
-        <w:jc w:val="both"/>
-        <w:rPr>
-          <w:rFonts w:ascii="Times New Roman" w:hAnsi="Times New Roman" w:cs="Times New Roman"/>
-        </w:rPr>
-      </w:pPr>
-    </w:p>
-    <w:p>
-      <w:pPr>
-        <w:spacing w:before="120" w:after="120"/>
-        <w:jc w:val="both"/>
-        <w:rPr>
-          <w:rFonts w:ascii="Times New Roman" w:hAnsi="Times New Roman" w:cs="Times New Roman"/>
-        </w:rPr>
-      </w:pPr>
-    </w:p>
-    <w:p>
-      <w:pPr>
-        <w:spacing w:before="120" w:after="120"/>
-        <w:jc w:val="both"/>
-        <w:rPr>
-          <w:rFonts w:ascii="Times New Roman" w:hAnsi="Times New Roman" w:cs="Times New Roman"/>
-        </w:rPr>
-      </w:pPr>
-    </w:p>
-    <w:p>
-      <w:pPr>
-        <w:spacing w:before="120" w:after="120"/>
-        <w:jc w:val="both"/>
-        <w:rPr>
-          <w:rFonts w:ascii="Times New Roman" w:hAnsi="Times New Roman" w:cs="Times New Roman"/>
-        </w:rPr>
-      </w:pPr>
-    </w:p>
-    <w:p>
-      <w:pPr>
-        <w:spacing w:before="120" w:after="120"/>
-        <w:jc w:val="both"/>
-        <w:rPr>
-          <w:rFonts w:ascii="Times New Roman" w:hAnsi="Times New Roman" w:cs="Times New Roman"/>
-        </w:rPr>
-      </w:pPr>
-    </w:p>
-    <w:p>
-      <w:pPr>
-        <w:spacing w:before="120" w:after="120"/>
-        <w:jc w:val="both"/>
-        <w:rPr>
-          <w:rFonts w:ascii="Times New Roman" w:hAnsi="Times New Roman" w:cs="Times New Roman"/>
-        </w:rPr>
-      </w:pPr>
-    </w:p>
-    <w:p>
-      <w:pPr>
-        <w:spacing w:before="120" w:after="120"/>
-        <w:jc w:val="center"/>
-        <w:rPr>
-          <w:rFonts w:ascii="Times New Roman" w:hAnsi="Times New Roman" w:cs="Times New Roman"/>
-        </w:rPr>
-      </w:pPr>
-      <w:r>
-        <w:rPr>
-          <w:rFonts w:ascii="Times New Roman" w:hAnsi="Times New Roman" w:cs="Times New Roman"/>
-          <w:i/>
-          <w:iCs/>
-        </w:rPr>
-        <w:t xml:space="preserve">Figure 1: </w:t>
-      </w:r>
-      <w:r>
-        <w:rPr>
-          <w:rFonts w:ascii="Times New Roman" w:hAnsi="Times New Roman" w:cs="Times New Roman"/>
-          <w:i/>
-          <w:iCs/>
-        </w:rPr>
-        <w:t xml:space="preserve">Satellite image showing Cyclone </w:t>
-      </w:r>
-      <w:proofErr w:type="spellStart"/>
-      <w:r>
-        <w:rPr>
-          <w:rFonts w:ascii="Times New Roman" w:hAnsi="Times New Roman" w:cs="Times New Roman"/>
-          <w:i/>
-          <w:iCs/>
-        </w:rPr>
-        <w:t>Ditwah</w:t>
-      </w:r>
-      <w:proofErr w:type="spellEnd"/>
-      <w:r>
-        <w:rPr>
-          <w:rFonts w:ascii="Times New Roman" w:hAnsi="Times New Roman" w:cs="Times New Roman"/>
-          <w:i/>
-          <w:iCs/>
-        </w:rPr>
-        <w:t xml:space="preserve"> over Sri Lanka (2025). Source: Wikimedia Commons, CC BY 2.0.</w:t>
-      </w:r>
-    </w:p>
-    <w:p>
-      <w:pPr>
-        <w:spacing w:before="120" w:after="120"/>
-        <w:jc w:val="both"/>
-        <w:rPr>
-          <w:rFonts w:ascii="Times New Roman" w:hAnsi="Times New Roman" w:cs="Times New Roman"/>
-        </w:rPr>
-      </w:pPr>
-      <w:r>
-        <w:rPr>
-          <w:rFonts w:ascii="Times New Roman" w:hAnsi="Times New Roman" w:cs="Times New Roman"/>
-        </w:rPr>
-        <w:lastRenderedPageBreak/>
-        <w:t>Unusual observations</w:t>
-      </w:r>
-      <w:r>
-        <w:rPr>
-          <w:rFonts w:ascii="Times New Roman" w:hAnsi="Times New Roman" w:cs="Times New Roman"/>
-        </w:rPr>
-        <w:t xml:space="preserve"> </w:t>
-      </w:r>
-      <w:r>
-        <w:rPr>
-          <w:rFonts w:ascii="Times New Roman" w:hAnsi="Times New Roman" w:cs="Times New Roman"/>
-        </w:rPr>
-        <w:t>in data usually s</w:t>
-      </w:r>
-      <w:r>
-        <w:rPr>
-          <w:rFonts w:ascii="Times New Roman" w:hAnsi="Times New Roman" w:cs="Times New Roman"/>
-        </w:rPr>
-        <w:t xml:space="preserve">peak </w:t>
-      </w:r>
-      <w:r>
-        <w:rPr>
-          <w:rFonts w:ascii="Times New Roman" w:hAnsi="Times New Roman" w:cs="Times New Roman"/>
-        </w:rPr>
-        <w:t>f</w:t>
-      </w:r>
-      <w:r>
-        <w:rPr>
-          <w:rFonts w:ascii="Times New Roman" w:hAnsi="Times New Roman" w:cs="Times New Roman"/>
-        </w:rPr>
-        <w:t>irs</w:t>
-      </w:r>
-      <w:r>
-        <w:rPr>
-          <w:rFonts w:ascii="Times New Roman" w:hAnsi="Times New Roman" w:cs="Times New Roman"/>
-        </w:rPr>
-        <w:t xml:space="preserve">t. </w:t>
-      </w:r>
-      <w:r>
-        <w:rPr>
-          <w:rFonts w:ascii="Times New Roman" w:hAnsi="Times New Roman" w:cs="Times New Roman"/>
-        </w:rPr>
-        <w:t xml:space="preserve">Disasters </w:t>
-      </w:r>
-      <w:r>
-        <w:rPr>
-          <w:rFonts w:ascii="Times New Roman" w:hAnsi="Times New Roman" w:cs="Times New Roman"/>
-        </w:rPr>
-        <w:t>f</w:t>
-      </w:r>
-      <w:r>
-        <w:rPr>
-          <w:rFonts w:ascii="Times New Roman" w:hAnsi="Times New Roman" w:cs="Times New Roman"/>
-        </w:rPr>
-        <w:t xml:space="preserve">ollow </w:t>
-      </w:r>
-      <w:r>
-        <w:rPr>
-          <w:rFonts w:ascii="Times New Roman" w:hAnsi="Times New Roman" w:cs="Times New Roman"/>
-        </w:rPr>
-        <w:t>o</w:t>
-      </w:r>
-      <w:r>
-        <w:rPr>
-          <w:rFonts w:ascii="Times New Roman" w:hAnsi="Times New Roman" w:cs="Times New Roman"/>
-        </w:rPr>
-        <w:t xml:space="preserve">nly </w:t>
-      </w:r>
-      <w:r>
-        <w:rPr>
-          <w:rFonts w:ascii="Times New Roman" w:hAnsi="Times New Roman" w:cs="Times New Roman"/>
-        </w:rPr>
-        <w:t>i</w:t>
-      </w:r>
-      <w:r>
-        <w:rPr>
-          <w:rFonts w:ascii="Times New Roman" w:hAnsi="Times New Roman" w:cs="Times New Roman"/>
-        </w:rPr>
-        <w:t xml:space="preserve">f </w:t>
-      </w:r>
-      <w:r>
-        <w:rPr>
-          <w:rFonts w:ascii="Times New Roman" w:hAnsi="Times New Roman" w:cs="Times New Roman"/>
-        </w:rPr>
-        <w:t>w</w:t>
-      </w:r>
-      <w:r>
-        <w:rPr>
-          <w:rFonts w:ascii="Times New Roman" w:hAnsi="Times New Roman" w:cs="Times New Roman"/>
-        </w:rPr>
-        <w:t xml:space="preserve">e </w:t>
-      </w:r>
-      <w:r>
-        <w:rPr>
-          <w:rFonts w:ascii="Times New Roman" w:hAnsi="Times New Roman" w:cs="Times New Roman"/>
-        </w:rPr>
-        <w:t>i</w:t>
-      </w:r>
-      <w:r>
-        <w:rPr>
-          <w:rFonts w:ascii="Times New Roman" w:hAnsi="Times New Roman" w:cs="Times New Roman"/>
-        </w:rPr>
-        <w:t xml:space="preserve">gnore </w:t>
-      </w:r>
-      <w:r>
-        <w:rPr>
-          <w:rFonts w:ascii="Times New Roman" w:hAnsi="Times New Roman" w:cs="Times New Roman"/>
-        </w:rPr>
-        <w:t>t</w:t>
-      </w:r>
-      <w:r>
-        <w:rPr>
-          <w:rFonts w:ascii="Times New Roman" w:hAnsi="Times New Roman" w:cs="Times New Roman"/>
-        </w:rPr>
-        <w:t>hem</w:t>
-      </w:r>
-      <w:r>
-        <w:rPr>
-          <w:rFonts w:ascii="Times New Roman" w:hAnsi="Times New Roman" w:cs="Times New Roman"/>
-        </w:rPr>
-        <w:t xml:space="preserve">. </w:t>
-      </w:r>
-      <w:r>
-        <w:rPr>
-          <w:rFonts w:ascii="Times New Roman" w:hAnsi="Times New Roman" w:cs="Times New Roman"/>
-        </w:rPr>
-        <w:t xml:space="preserve">In most data modeling workflows, we start the modeling process with the </w:t>
-      </w:r>
-      <w:r>
-        <w:rPr>
-          <w:rFonts w:ascii="Times New Roman" w:hAnsi="Times New Roman" w:cs="Times New Roman"/>
-        </w:rPr>
-        <w:t>preprocessing</w:t>
-      </w:r>
-      <w:r>
-        <w:rPr>
-          <w:rFonts w:ascii="Times New Roman" w:hAnsi="Times New Roman" w:cs="Times New Roman"/>
-        </w:rPr>
-        <w:t xml:space="preserve"> step, where unusual observations, also known as outliers or anomalies, are detected and often deleted</w:t>
-      </w:r>
-      <w:r>
-        <w:rPr>
-          <w:rFonts w:ascii="Times New Roman" w:hAnsi="Times New Roman" w:cs="Times New Roman"/>
-        </w:rPr>
-        <w:t xml:space="preserve"> or ignored</w:t>
-      </w:r>
-      <w:r>
-        <w:rPr>
-          <w:rFonts w:ascii="Times New Roman" w:hAnsi="Times New Roman" w:cs="Times New Roman"/>
-        </w:rPr>
-        <w:t xml:space="preserve"> to avoid biased estimates, </w:t>
-      </w:r>
-      <w:proofErr w:type="spellStart"/>
-      <w:r>
-        <w:rPr>
-          <w:rFonts w:ascii="Times New Roman" w:hAnsi="Times New Roman" w:cs="Times New Roman"/>
-        </w:rPr>
-        <w:t>misspecified</w:t>
-      </w:r>
-      <w:proofErr w:type="spellEnd"/>
-      <w:r>
-        <w:rPr>
-          <w:rFonts w:ascii="Times New Roman" w:hAnsi="Times New Roman" w:cs="Times New Roman"/>
-        </w:rPr>
-        <w:t xml:space="preserve"> models, misleading results, and poor decisions. Yet in some cases, these unusual observations can be the main carriers of vital information and identifying them, instead of deleting them, should be the central goal of the modeling process.</w:t>
-      </w:r>
-      <w:r>
-        <w:rPr>
-          <w:rFonts w:ascii="Times New Roman" w:hAnsi="Times New Roman" w:cs="Times New Roman"/>
-        </w:rPr>
-        <w:t xml:space="preserve"> </w:t>
-      </w:r>
-      <w:r>
-        <w:rPr>
-          <w:rFonts w:ascii="Times New Roman" w:hAnsi="Times New Roman" w:cs="Times New Roman"/>
-        </w:rPr>
-        <w:t>Extreme weather conditions such as cyclones and floods are a clear example of this reality</w:t>
-      </w:r>
-      <w:r>
-        <w:rPr>
-          <w:rFonts w:ascii="Times New Roman" w:hAnsi="Times New Roman" w:cs="Times New Roman"/>
-          <w:b/>
-          <w:bCs/>
-        </w:rPr>
-        <w:t>.</w:t>
-      </w:r>
-    </w:p>
-    <w:p>
-      <w:pPr>
-        <w:spacing w:before="120" w:after="120"/>
-        <w:jc w:val="center"/>
-        <w:rPr>
-          <w:rFonts w:ascii="Times New Roman" w:hAnsi="Times New Roman" w:cs="Times New Roman"/>
-          <w:i/>
-          <w:iCs/>
-          <w:sz w:val="32"/>
-          <w:szCs w:val="32"/>
-        </w:rPr>
-      </w:pPr>
-      <w:r>
-        <w:rPr>
-          <w:rFonts w:ascii="Times New Roman" w:hAnsi="Times New Roman" w:cs="Times New Roman"/>
-          <w:sz w:val="32"/>
-          <w:szCs w:val="32"/>
-        </w:rPr>
-        <w:t>“</w:t>
-      </w:r>
-      <w:r>
-        <w:rPr>
-          <w:rFonts w:ascii="Times New Roman" w:hAnsi="Times New Roman" w:cs="Times New Roman"/>
-          <w:i/>
-          <w:iCs/>
-          <w:sz w:val="32"/>
-          <w:szCs w:val="32"/>
-        </w:rPr>
-        <w:t>Unusual observations</w:t>
-      </w:r>
-      <w:r>
-        <w:rPr>
-          <w:rFonts w:ascii="Times New Roman" w:hAnsi="Times New Roman" w:cs="Times New Roman"/>
-          <w:i/>
-          <w:iCs/>
-          <w:sz w:val="32"/>
-          <w:szCs w:val="32"/>
-        </w:rPr>
-        <w:t xml:space="preserve"> in data speak first. Disasters follow only if we ignore them.”</w:t>
-      </w:r>
-    </w:p>
-    <w:p>
-      <w:pPr>
-        <w:spacing w:before="120" w:after="120"/>
-        <w:jc w:val="both"/>
-        <w:rPr>
-          <w:rFonts w:ascii="Times New Roman" w:hAnsi="Times New Roman" w:cs="Times New Roman"/>
-        </w:rPr>
-      </w:pPr>
       <w:r>
         <w:rPr>
           <w:noProof/>
         </w:rPr>
         <w:drawing>
-          <wp:anchor distT="0" distB="0" distL="114300" distR="114300" simplePos="0" relativeHeight="251665408" behindDoc="1" locked="0" layoutInCell="1" allowOverlap="1" wp14:anchorId="2EA1667C" wp14:editId="3D2D7B3C">
+          <wp:anchor distT="0" distB="0" distL="114300" distR="114300" simplePos="0" relativeHeight="251670528" behindDoc="1" locked="0" layoutInCell="1" allowOverlap="1" wp14:anchorId="43F26999" wp14:editId="3078DA00">
             <wp:simplePos x="0" y="0"/>
             <wp:positionH relativeFrom="page">
-              <wp:posOffset>1268095</wp:posOffset>
+              <wp:posOffset>3593556</wp:posOffset>
             </wp:positionH>
             <wp:positionV relativeFrom="paragraph">
-              <wp:posOffset>56515</wp:posOffset>
+              <wp:posOffset>229507</wp:posOffset>
             </wp:positionV>
-            <wp:extent cx="5368290" cy="5441950"/>
-            <wp:effectExtent l="0" t="0" r="3810" b="6350"/>
+            <wp:extent cx="3230880" cy="3318510"/>
+            <wp:effectExtent l="0" t="0" r="7620" b="0"/>
             <wp:wrapThrough wrapText="bothSides">
               <wp:wrapPolygon edited="0">
                 <wp:start x="0" y="0"/>
-                <wp:lineTo x="0" y="21550"/>
-                <wp:lineTo x="21539" y="21550"/>
-                <wp:lineTo x="21539" y="0"/>
+                <wp:lineTo x="0" y="21451"/>
+                <wp:lineTo x="21524" y="21451"/>
+                <wp:lineTo x="21524" y="0"/>
                 <wp:lineTo x="0" y="0"/>
               </wp:wrapPolygon>
             </wp:wrapThrough>
@@ -810,7 +612,7 @@
                     </pic:cNvPicPr>
                   </pic:nvPicPr>
                   <pic:blipFill rotWithShape="1">
-                    <a:blip r:embed="rId10">
+                    <a:blip r:embed="rId11">
                       <a:extLst>
                         <a:ext uri="{28A0092B-C50C-407E-A947-70E740481C1C}">
                           <a14:useLocalDpi xmlns:a14="http://schemas.microsoft.com/office/drawing/2010/main" val="0"/>
@@ -825,7 +627,7 @@
                   <pic:spPr bwMode="auto">
                     <a:xfrm>
                       <a:off x="0" y="0"/>
-                      <a:ext cx="5368290" cy="5441950"/>
+                      <a:ext cx="3230880" cy="3318510"/>
                     </a:xfrm>
                     <a:prstGeom prst="rect">
                       <a:avLst/>
@@ -856,6 +658,49 @@
     <w:p>
       <w:pPr>
         <w:spacing w:before="120" w:after="120"/>
+        <w:jc w:val="center"/>
+        <w:rPr>
+          <w:rFonts w:ascii="Times New Roman" w:hAnsi="Times New Roman" w:cs="Times New Roman"/>
+          <w:sz w:val="22"/>
+          <w:szCs w:val="22"/>
+        </w:rPr>
+      </w:pPr>
+      <w:r>
+        <w:rPr>
+          <w:rFonts w:ascii="Times New Roman" w:hAnsi="Times New Roman" w:cs="Times New Roman"/>
+          <w:sz w:val="22"/>
+          <w:szCs w:val="22"/>
+        </w:rPr>
+        <w:t xml:space="preserve">Figure 2: </w:t>
+      </w:r>
+      <w:r>
+        <w:rPr>
+          <w:rFonts w:ascii="Times New Roman" w:hAnsi="Times New Roman" w:cs="Times New Roman"/>
+          <w:sz w:val="22"/>
+          <w:szCs w:val="22"/>
+        </w:rPr>
+        <w:t xml:space="preserve">Left: Satellite image showing Cyclone Ditwah over Sri Lanka (2025). Source: Wikimedia Commons, CC BY 2.0. Right: </w:t>
+      </w:r>
+      <w:r>
+        <w:rPr>
+          <w:rFonts w:ascii="Times New Roman" w:hAnsi="Times New Roman" w:cs="Times New Roman"/>
+          <w:sz w:val="22"/>
+          <w:szCs w:val="22"/>
+        </w:rPr>
+        <w:t xml:space="preserve">Spatial distribution of </w:t>
+      </w:r>
+      <w:r>
+        <w:rPr>
+          <w:rFonts w:ascii="Times New Roman" w:hAnsi="Times New Roman" w:cs="Times New Roman"/>
+          <w:sz w:val="22"/>
+          <w:szCs w:val="22"/>
+        </w:rPr>
+        <w:t>people affected by Cyclone Ditwah across Sri Lanka. Data source: Ministry of Defence, National Disaster Relief Services Centre (NDRSC), District-wise Current Situation Report (21 November–31 December 2025).</w:t>
+      </w:r>
+    </w:p>
+    <w:p>
+      <w:pPr>
+        <w:spacing w:before="120" w:after="120"/>
         <w:jc w:val="both"/>
         <w:rPr>
           <w:rFonts w:ascii="Times New Roman" w:hAnsi="Times New Roman" w:cs="Times New Roman"/>
@@ -866,10 +711,145 @@
       <w:pPr>
         <w:spacing w:before="120" w:after="120"/>
         <w:jc w:val="both"/>
-        <w:rPr>
-          <w:rFonts w:ascii="Times New Roman" w:hAnsi="Times New Roman" w:cs="Times New Roman"/>
-        </w:rPr>
-      </w:pPr>
+      </w:pPr>
+      <w:r>
+        <w:rPr>
+          <w:rFonts w:ascii="Times New Roman" w:hAnsi="Times New Roman" w:cs="Times New Roman"/>
+        </w:rPr>
+        <w:t>Recently Sri Lanka experienced widespread floods and landslides across all the districts in the country with the landfall of Cyclone Ditwah in late November 2025.</w:t>
+      </w:r>
+      <w:r>
+        <w:rPr>
+          <w:rFonts w:ascii="Times New Roman" w:hAnsi="Times New Roman" w:cs="Times New Roman"/>
+        </w:rPr>
+        <w:t xml:space="preserve"> According to the World Bank Group's Global Rapid Post-Disaster Damage Estimation (GRADE) </w:t>
+      </w:r>
+      <w:r>
+        <w:rPr>
+          <w:rFonts w:ascii="Times New Roman" w:hAnsi="Times New Roman" w:cs="Times New Roman"/>
+        </w:rPr>
+        <w:t>r</w:t>
+      </w:r>
+      <w:r>
+        <w:rPr>
+          <w:rFonts w:ascii="Times New Roman" w:hAnsi="Times New Roman" w:cs="Times New Roman"/>
+        </w:rPr>
+        <w:t xml:space="preserve">eport on Cyclone Ditwah 2025, </w:t>
+      </w:r>
+      <w:r>
+        <w:rPr>
+          <w:rFonts w:ascii="Times New Roman" w:hAnsi="Times New Roman" w:cs="Times New Roman"/>
+        </w:rPr>
+        <w:t xml:space="preserve">Sri Lanka faced the worst natural disaster in recent history since the 2004 tsunami. </w:t>
+      </w:r>
+      <w:r>
+        <w:rPr>
+          <w:rFonts w:ascii="Times New Roman" w:hAnsi="Times New Roman" w:cs="Times New Roman"/>
+        </w:rPr>
+        <w:t xml:space="preserve">It resulted in the loss </w:t>
+      </w:r>
+      <w:r>
+        <w:rPr>
+          <w:rFonts w:ascii="Times New Roman" w:hAnsi="Times New Roman" w:cs="Times New Roman"/>
+        </w:rPr>
+        <w:t>of over</w:t>
+      </w:r>
+      <w:r>
+        <w:rPr>
+          <w:rFonts w:ascii="Times New Roman" w:hAnsi="Times New Roman" w:cs="Times New Roman"/>
+        </w:rPr>
+        <w:t xml:space="preserve"> </w:t>
+      </w:r>
+      <w:r>
+        <w:rPr>
+          <w:rFonts w:ascii="Times New Roman" w:hAnsi="Times New Roman" w:cs="Times New Roman"/>
+        </w:rPr>
+        <w:t>650</w:t>
+      </w:r>
+      <w:r>
+        <w:rPr>
+          <w:rFonts w:ascii="Times New Roman" w:hAnsi="Times New Roman" w:cs="Times New Roman"/>
+        </w:rPr>
+        <w:t xml:space="preserve"> innocent lives</w:t>
+      </w:r>
+      <w:r>
+        <w:rPr>
+          <w:rFonts w:ascii="Times New Roman" w:hAnsi="Times New Roman" w:cs="Times New Roman"/>
+        </w:rPr>
+        <w:t xml:space="preserve">. In addition, more than 6000 houses were completely destroyed and over 100,000 partially damaged, </w:t>
+      </w:r>
+      <w:r>
+        <w:rPr>
+          <w:rFonts w:ascii="Times New Roman" w:hAnsi="Times New Roman" w:cs="Times New Roman"/>
+        </w:rPr>
+        <w:t xml:space="preserve">causing </w:t>
+      </w:r>
+      <w:r>
+        <w:rPr>
+          <w:rFonts w:ascii="Times New Roman" w:hAnsi="Times New Roman" w:cs="Times New Roman"/>
+        </w:rPr>
+        <w:t xml:space="preserve">economic losses exceeding </w:t>
+      </w:r>
+      <w:r>
+        <w:rPr>
+          <w:rFonts w:ascii="Times New Roman" w:hAnsi="Times New Roman" w:cs="Times New Roman"/>
+        </w:rPr>
+        <w:t>4 billion US dollars of damage across the country.  </w:t>
+      </w:r>
+      <w:r>
+        <w:rPr>
+          <w:rFonts w:ascii="Times New Roman" w:hAnsi="Times New Roman" w:cs="Times New Roman"/>
+        </w:rPr>
+        <w:t>T</w:t>
+      </w:r>
+      <w:r>
+        <w:rPr>
+          <w:rFonts w:ascii="Times New Roman" w:hAnsi="Times New Roman" w:cs="Times New Roman"/>
+        </w:rPr>
+        <w:t>his damage is about 4 percent of Sri Lanka’s GDP.  </w:t>
+      </w:r>
+      <w:r>
+        <w:rPr>
+          <w:rFonts w:ascii="Times New Roman" w:hAnsi="Times New Roman" w:cs="Times New Roman"/>
+        </w:rPr>
+        <w:t xml:space="preserve"> </w:t>
+      </w:r>
+      <w:r>
+        <w:rPr>
+          <w:rFonts w:ascii="Times New Roman" w:hAnsi="Times New Roman" w:cs="Times New Roman"/>
+        </w:rPr>
+        <w:t xml:space="preserve">Even though Cyclone Ditwah’s center was off Sri Lanka’s eastern coast, Colombo, the largest city </w:t>
+      </w:r>
+      <w:r>
+        <w:rPr>
+          <w:rFonts w:ascii="Times New Roman" w:hAnsi="Times New Roman" w:cs="Times New Roman"/>
+        </w:rPr>
+        <w:t>in</w:t>
+      </w:r>
+      <w:r>
+        <w:rPr>
+          <w:rFonts w:ascii="Times New Roman" w:hAnsi="Times New Roman" w:cs="Times New Roman"/>
+        </w:rPr>
+        <w:t xml:space="preserve"> Sri Lanka by population, recorded the highest impact, with over 30,000 people affected</w:t>
+      </w:r>
+      <w:r>
+        <w:rPr>
+          <w:rFonts w:ascii="Times New Roman" w:hAnsi="Times New Roman" w:cs="Times New Roman"/>
+        </w:rPr>
+        <w:t xml:space="preserve"> (Figure 2)</w:t>
+      </w:r>
+      <w:r>
+        <w:rPr>
+          <w:rFonts w:ascii="Times New Roman" w:hAnsi="Times New Roman" w:cs="Times New Roman"/>
+        </w:rPr>
+        <w:t>, as persistent rainfall triggered Kelani River overflow and severe urban flooding that overwhelmed the city’s drainage system</w:t>
+      </w:r>
+      <w:r>
+        <w:rPr>
+          <w:rFonts w:ascii="Times New Roman" w:hAnsi="Times New Roman" w:cs="Times New Roman"/>
+        </w:rPr>
+        <w:t>.</w:t>
+      </w:r>
     </w:p>
     <w:p>
       <w:pPr>
@@ -879,381 +859,18 @@
           <w:rFonts w:ascii="Times New Roman" w:hAnsi="Times New Roman" w:cs="Times New Roman"/>
         </w:rPr>
       </w:pPr>
-    </w:p>
-    <w:p>
-      <w:pPr>
-        <w:spacing w:before="120" w:after="120"/>
-        <w:jc w:val="both"/>
-        <w:rPr>
-          <w:rFonts w:ascii="Times New Roman" w:hAnsi="Times New Roman" w:cs="Times New Roman"/>
-        </w:rPr>
-      </w:pPr>
-    </w:p>
-    <w:p>
-      <w:pPr>
-        <w:spacing w:before="120" w:after="120"/>
-        <w:jc w:val="both"/>
-        <w:rPr>
-          <w:rFonts w:ascii="Times New Roman" w:hAnsi="Times New Roman" w:cs="Times New Roman"/>
-        </w:rPr>
-      </w:pPr>
-    </w:p>
-    <w:p>
-      <w:pPr>
-        <w:spacing w:before="120" w:after="120"/>
-        <w:jc w:val="center"/>
-        <w:rPr>
-          <w:rFonts w:ascii="Times New Roman" w:hAnsi="Times New Roman" w:cs="Times New Roman"/>
-          <w:i/>
-          <w:iCs/>
-        </w:rPr>
-      </w:pPr>
-      <w:r>
-        <w:rPr>
-          <w:rFonts w:ascii="Times New Roman" w:hAnsi="Times New Roman" w:cs="Times New Roman"/>
-          <w:i/>
-          <w:iCs/>
-        </w:rPr>
-        <w:t>Figure</w:t>
-      </w:r>
-      <w:r>
-        <w:rPr>
-          <w:rFonts w:ascii="Times New Roman" w:hAnsi="Times New Roman" w:cs="Times New Roman"/>
-          <w:i/>
-          <w:iCs/>
-        </w:rPr>
-        <w:t xml:space="preserve"> 2</w:t>
-      </w:r>
-      <w:r>
-        <w:rPr>
-          <w:rFonts w:ascii="Times New Roman" w:hAnsi="Times New Roman" w:cs="Times New Roman"/>
-          <w:i/>
-          <w:iCs/>
-        </w:rPr>
-        <w:t xml:space="preserve">: </w:t>
-      </w:r>
-      <w:r>
-        <w:rPr>
-          <w:rFonts w:ascii="Times New Roman" w:hAnsi="Times New Roman" w:cs="Times New Roman"/>
-          <w:i/>
-          <w:iCs/>
-        </w:rPr>
-        <w:t>S</w:t>
-      </w:r>
-      <w:r>
-        <w:rPr>
-          <w:rFonts w:ascii="Times New Roman" w:hAnsi="Times New Roman" w:cs="Times New Roman"/>
-          <w:i/>
-          <w:iCs/>
-        </w:rPr>
-        <w:t xml:space="preserve">patial </w:t>
-      </w:r>
-      <w:r>
-        <w:rPr>
-          <w:rFonts w:ascii="Times New Roman" w:hAnsi="Times New Roman" w:cs="Times New Roman"/>
-          <w:i/>
-          <w:iCs/>
-        </w:rPr>
-        <w:t>d</w:t>
-      </w:r>
-      <w:r>
-        <w:rPr>
-          <w:rFonts w:ascii="Times New Roman" w:hAnsi="Times New Roman" w:cs="Times New Roman"/>
-          <w:i/>
-          <w:iCs/>
-        </w:rPr>
-        <w:t>istribution of</w:t>
-      </w:r>
-      <w:r>
-        <w:rPr>
-          <w:rFonts w:ascii="Times New Roman" w:hAnsi="Times New Roman" w:cs="Times New Roman"/>
-          <w:i/>
-          <w:iCs/>
-        </w:rPr>
-        <w:t xml:space="preserve"> </w:t>
-      </w:r>
-      <w:r>
-        <w:rPr>
-          <w:rFonts w:ascii="Times New Roman" w:hAnsi="Times New Roman" w:cs="Times New Roman"/>
-          <w:i/>
-          <w:iCs/>
-        </w:rPr>
-        <w:t xml:space="preserve">people affected by Cyclone </w:t>
-      </w:r>
-      <w:proofErr w:type="spellStart"/>
-      <w:r>
-        <w:rPr>
-          <w:rFonts w:ascii="Times New Roman" w:hAnsi="Times New Roman" w:cs="Times New Roman"/>
-          <w:i/>
-          <w:iCs/>
-        </w:rPr>
-        <w:t>Ditwah</w:t>
-      </w:r>
-      <w:proofErr w:type="spellEnd"/>
-      <w:r>
-        <w:rPr>
-          <w:rFonts w:ascii="Times New Roman" w:hAnsi="Times New Roman" w:cs="Times New Roman"/>
-          <w:i/>
-          <w:iCs/>
-        </w:rPr>
-        <w:t xml:space="preserve"> across Sri Lanka. Data source: Ministry of </w:t>
-      </w:r>
-      <w:proofErr w:type="spellStart"/>
-      <w:r>
-        <w:rPr>
-          <w:rFonts w:ascii="Times New Roman" w:hAnsi="Times New Roman" w:cs="Times New Roman"/>
-          <w:i/>
-          <w:iCs/>
-        </w:rPr>
-        <w:t>Defence</w:t>
-      </w:r>
-      <w:proofErr w:type="spellEnd"/>
-      <w:r>
-        <w:rPr>
-          <w:rFonts w:ascii="Times New Roman" w:hAnsi="Times New Roman" w:cs="Times New Roman"/>
-          <w:i/>
-          <w:iCs/>
-        </w:rPr>
-        <w:t>, National Disaster Relief Services Centre (NDRSC), District-wise Current Situation Report (21 November–31 December 2025).</w:t>
-      </w:r>
-    </w:p>
-    <w:p>
-      <w:pPr>
-        <w:spacing w:before="120" w:after="120"/>
-        <w:jc w:val="both"/>
-        <w:rPr>
-          <w:rFonts w:ascii="Times New Roman" w:hAnsi="Times New Roman" w:cs="Times New Roman"/>
-        </w:rPr>
-      </w:pPr>
-    </w:p>
-    <w:p>
-      <w:pPr>
-        <w:spacing w:before="120" w:after="120"/>
-        <w:jc w:val="both"/>
-      </w:pPr>
+      <w:r>
+        <w:rPr>
+          <w:rFonts w:ascii="Times New Roman" w:hAnsi="Times New Roman" w:cs="Times New Roman"/>
+        </w:rPr>
+        <w:t xml:space="preserve">The Disaster Management Centre website of Sri Lanka’s Ministry of Defense (https://www.dmc.gov.lk/) has been providing irregular but frequent updates on river water levels of several gauging stations across multiple water basins all around the country, even well before the Ditwah Cyclone made landfall. It also contains flood warning thresholds for alerts as well as minor and major flood warnings. Despite these efforts, the country experienced massive damage affecting lives, homes, infrastructure, and essential services. The question, then, is why the country was unable to avoid or at least minimize such massive losses even when relevant data was readily available throughout the event. The sections that follow take a </w:t>
+      </w:r>
       <w:r>
         <w:rPr>
           <w:rFonts w:ascii="Times New Roman" w:hAnsi="Times New Roman" w:cs="Times New Roman"/>
         </w:rPr>
         <w:lastRenderedPageBreak/>
-        <w:t xml:space="preserve">Recently Sri Lanka experienced widespread floods and landslides across all the districts in the country with the landfall of Cyclone </w:t>
-      </w:r>
-      <w:proofErr w:type="spellStart"/>
-      <w:r>
-        <w:rPr>
-          <w:rFonts w:ascii="Times New Roman" w:hAnsi="Times New Roman" w:cs="Times New Roman"/>
-        </w:rPr>
-        <w:t>Ditwah</w:t>
-      </w:r>
-      <w:proofErr w:type="spellEnd"/>
-      <w:r>
-        <w:rPr>
-          <w:rFonts w:ascii="Times New Roman" w:hAnsi="Times New Roman" w:cs="Times New Roman"/>
-        </w:rPr>
-        <w:t xml:space="preserve"> in late November 2025.</w:t>
-      </w:r>
-      <w:r>
-        <w:rPr>
-          <w:rFonts w:ascii="Times New Roman" w:hAnsi="Times New Roman" w:cs="Times New Roman"/>
-        </w:rPr>
-        <w:t xml:space="preserve"> According to the World Bank Group's Global Rapid Post-Disaster Damage Estimation (GRADE) </w:t>
-      </w:r>
-      <w:r>
-        <w:rPr>
-          <w:rFonts w:ascii="Times New Roman" w:hAnsi="Times New Roman" w:cs="Times New Roman"/>
-        </w:rPr>
-        <w:t>r</w:t>
-      </w:r>
-      <w:r>
-        <w:rPr>
-          <w:rFonts w:ascii="Times New Roman" w:hAnsi="Times New Roman" w:cs="Times New Roman"/>
-        </w:rPr>
-        <w:t xml:space="preserve">eport on Cyclone </w:t>
-      </w:r>
-      <w:proofErr w:type="spellStart"/>
-      <w:r>
-        <w:rPr>
-          <w:rFonts w:ascii="Times New Roman" w:hAnsi="Times New Roman" w:cs="Times New Roman"/>
-        </w:rPr>
-        <w:t>Ditwah</w:t>
-      </w:r>
-      <w:proofErr w:type="spellEnd"/>
-      <w:r>
-        <w:rPr>
-          <w:rFonts w:ascii="Times New Roman" w:hAnsi="Times New Roman" w:cs="Times New Roman"/>
-        </w:rPr>
-        <w:t xml:space="preserve"> 2025, </w:t>
-      </w:r>
-      <w:r>
-        <w:rPr>
-          <w:rFonts w:ascii="Times New Roman" w:hAnsi="Times New Roman" w:cs="Times New Roman"/>
-        </w:rPr>
-        <w:t xml:space="preserve">Sri Lanka faced the worst natural disaster in recent history since the 2004 tsunami. </w:t>
-      </w:r>
-      <w:r>
-        <w:rPr>
-          <w:rFonts w:ascii="Times New Roman" w:hAnsi="Times New Roman" w:cs="Times New Roman"/>
-        </w:rPr>
-        <w:t xml:space="preserve">It resulted in the loss </w:t>
-      </w:r>
-      <w:r>
-        <w:rPr>
-          <w:rFonts w:ascii="Times New Roman" w:hAnsi="Times New Roman" w:cs="Times New Roman"/>
-        </w:rPr>
-        <w:t>of over</w:t>
-      </w:r>
-      <w:r>
-        <w:rPr>
-          <w:rFonts w:ascii="Times New Roman" w:hAnsi="Times New Roman" w:cs="Times New Roman"/>
-        </w:rPr>
-        <w:t xml:space="preserve"> </w:t>
-      </w:r>
-      <w:r>
-        <w:rPr>
-          <w:rFonts w:ascii="Times New Roman" w:hAnsi="Times New Roman" w:cs="Times New Roman"/>
-        </w:rPr>
-        <w:t>650</w:t>
-      </w:r>
-      <w:r>
-        <w:rPr>
-          <w:rFonts w:ascii="Times New Roman" w:hAnsi="Times New Roman" w:cs="Times New Roman"/>
-        </w:rPr>
-        <w:t xml:space="preserve"> innocent lives</w:t>
-      </w:r>
-      <w:r>
-        <w:rPr>
-          <w:rFonts w:ascii="Times New Roman" w:hAnsi="Times New Roman" w:cs="Times New Roman"/>
-        </w:rPr>
-        <w:t xml:space="preserve">. In addition, more than 6000 houses were </w:t>
-      </w:r>
-      <w:proofErr w:type="gramStart"/>
-      <w:r>
-        <w:rPr>
-          <w:rFonts w:ascii="Times New Roman" w:hAnsi="Times New Roman" w:cs="Times New Roman"/>
-        </w:rPr>
-        <w:t>completely destroyed</w:t>
-      </w:r>
-      <w:proofErr w:type="gramEnd"/>
-      <w:r>
-        <w:rPr>
-          <w:rFonts w:ascii="Times New Roman" w:hAnsi="Times New Roman" w:cs="Times New Roman"/>
-        </w:rPr>
-        <w:t xml:space="preserve"> and over 100,000 partially damaged, </w:t>
-      </w:r>
-      <w:r>
-        <w:rPr>
-          <w:rFonts w:ascii="Times New Roman" w:hAnsi="Times New Roman" w:cs="Times New Roman"/>
-        </w:rPr>
-        <w:t xml:space="preserve">causing </w:t>
-      </w:r>
-      <w:r>
-        <w:rPr>
-          <w:rFonts w:ascii="Times New Roman" w:hAnsi="Times New Roman" w:cs="Times New Roman"/>
-        </w:rPr>
-        <w:t xml:space="preserve">economic losses exceeding </w:t>
-      </w:r>
-      <w:r>
-        <w:rPr>
-          <w:rFonts w:ascii="Times New Roman" w:hAnsi="Times New Roman" w:cs="Times New Roman"/>
-        </w:rPr>
-        <w:t>4 billion US dollars of damage across the country.  </w:t>
-      </w:r>
-      <w:r>
-        <w:rPr>
-          <w:rFonts w:ascii="Times New Roman" w:hAnsi="Times New Roman" w:cs="Times New Roman"/>
-        </w:rPr>
-        <w:t>T</w:t>
-      </w:r>
-      <w:r>
-        <w:rPr>
-          <w:rFonts w:ascii="Times New Roman" w:hAnsi="Times New Roman" w:cs="Times New Roman"/>
-        </w:rPr>
-        <w:t>his damage is about 4 percent of Sri Lanka’s GDP.  </w:t>
-      </w:r>
-      <w:r>
-        <w:rPr>
-          <w:rFonts w:ascii="Times New Roman" w:hAnsi="Times New Roman" w:cs="Times New Roman"/>
-        </w:rPr>
-        <w:t xml:space="preserve"> </w:t>
-      </w:r>
-      <w:r>
-        <w:rPr>
-          <w:rFonts w:ascii="Times New Roman" w:hAnsi="Times New Roman" w:cs="Times New Roman"/>
-        </w:rPr>
-        <w:t xml:space="preserve">Even though Cyclone </w:t>
-      </w:r>
-      <w:proofErr w:type="spellStart"/>
-      <w:r>
-        <w:rPr>
-          <w:rFonts w:ascii="Times New Roman" w:hAnsi="Times New Roman" w:cs="Times New Roman"/>
-        </w:rPr>
-        <w:t>Ditwah’s</w:t>
-      </w:r>
-      <w:proofErr w:type="spellEnd"/>
-      <w:r>
-        <w:rPr>
-          <w:rFonts w:ascii="Times New Roman" w:hAnsi="Times New Roman" w:cs="Times New Roman"/>
-        </w:rPr>
-        <w:t xml:space="preserve"> center was off Sri Lanka’s eastern coast, Colombo, the largest city </w:t>
-      </w:r>
-      <w:r>
-        <w:rPr>
-          <w:rFonts w:ascii="Times New Roman" w:hAnsi="Times New Roman" w:cs="Times New Roman"/>
-        </w:rPr>
-        <w:t>in</w:t>
-      </w:r>
-      <w:r>
-        <w:rPr>
-          <w:rFonts w:ascii="Times New Roman" w:hAnsi="Times New Roman" w:cs="Times New Roman"/>
-        </w:rPr>
-        <w:t xml:space="preserve"> Sri Lanka by population, recorded the highest impact, with over 30,000 people affected</w:t>
-      </w:r>
-      <w:r>
-        <w:rPr>
-          <w:rFonts w:ascii="Times New Roman" w:hAnsi="Times New Roman" w:cs="Times New Roman"/>
-        </w:rPr>
-        <w:t xml:space="preserve"> (Figure 2)</w:t>
-      </w:r>
-      <w:r>
-        <w:rPr>
-          <w:rFonts w:ascii="Times New Roman" w:hAnsi="Times New Roman" w:cs="Times New Roman"/>
-        </w:rPr>
-        <w:t>, as persistent rainfall triggered Kelani River overflow and severe urban flooding that overwhelmed the city’s drainage system</w:t>
-      </w:r>
-      <w:r>
-        <w:rPr>
-          <w:rFonts w:ascii="Times New Roman" w:hAnsi="Times New Roman" w:cs="Times New Roman"/>
-        </w:rPr>
-        <w:t>.</w:t>
-      </w:r>
-    </w:p>
-    <w:p>
-      <w:pPr>
-        <w:spacing w:before="120" w:after="120"/>
-        <w:jc w:val="both"/>
-        <w:rPr>
-          <w:rFonts w:ascii="Times New Roman" w:hAnsi="Times New Roman" w:cs="Times New Roman"/>
-        </w:rPr>
-      </w:pPr>
-      <w:r>
-        <w:rPr>
-          <w:rFonts w:ascii="Times New Roman" w:hAnsi="Times New Roman" w:cs="Times New Roman"/>
-        </w:rPr>
-        <w:t xml:space="preserve">The Disaster Management Centre website of Sri Lanka’s Ministry of Defense (https://www.dmc.gov.lk/) has been providing irregular but frequent updates on river water levels of several gauging stations across multiple water basins all around the country, even well before the </w:t>
-      </w:r>
-      <w:proofErr w:type="spellStart"/>
-      <w:r>
-        <w:rPr>
-          <w:rFonts w:ascii="Times New Roman" w:hAnsi="Times New Roman" w:cs="Times New Roman"/>
-        </w:rPr>
-        <w:t>Ditwah</w:t>
-      </w:r>
-      <w:proofErr w:type="spellEnd"/>
-      <w:r>
-        <w:rPr>
-          <w:rFonts w:ascii="Times New Roman" w:hAnsi="Times New Roman" w:cs="Times New Roman"/>
-        </w:rPr>
-        <w:t xml:space="preserve"> Cyclone made landfall. It also contains flood warning thresholds for alerts as well as minor and major flood warnings. Despite these efforts, the country experienced massive damage affecting lives, homes, infrastructure, and essential services. The question, then, is why the country was unable to avoid or at least minimize such massive losses even when relevant data was readily available throughout the event. The sections that follow take a closer look at this issue through a SWOT analysis of Sri Lanka’s early flood warning system, exploring its strengths, weaknesses, opportunities, and threats.</w:t>
+        <w:t>closer look at this issue through a SWOT analysis of Sri Lanka’s early flood warning system, exploring its strengths, weaknesses, opportunities, and threats.</w:t>
       </w:r>
     </w:p>
     <w:p>
@@ -1989,16 +1606,9 @@
         <w:rPr>
           <w:rFonts w:ascii="Times New Roman" w:hAnsi="Times New Roman" w:cs="Times New Roman"/>
         </w:rPr>
-        <w:t xml:space="preserve">Sri Lanka’s flood warning practices do not need to start from scratch, as they already have a solid foundation that can be strengthened and improved. For instance, the country maintains a rich database with frequent real-time measures of river level data accessible through the </w:t>
-      </w:r>
-      <w:r>
-        <w:rPr>
-          <w:rFonts w:ascii="Times New Roman" w:hAnsi="Times New Roman" w:cs="Times New Roman"/>
-        </w:rPr>
-        <w:lastRenderedPageBreak/>
-        <w:t>Disaster Management Centre website. This provides a solid foundation for a better, updated, data-driven early warning system. Further, there are several open-source software tools with anomaly detection capabilities. For example, the recently released CRAN task view on anomaly detection (</w:t>
-      </w:r>
-      <w:hyperlink r:id="rId11" w:tgtFrame="_blank" w:history="1">
+        <w:t>Sri Lanka’s flood warning practices do not need to start from scratch, as they already have a solid foundation that can be strengthened and improved. For instance, the country maintains a rich database with frequent real-time measures of river level data accessible through the Disaster Management Centre website. This provides a solid foundation for a better, updated, data-driven early warning system. Further, there are several open-source software tools with anomaly detection capabilities. For example, the recently released CRAN task view on anomaly detection (</w:t>
+      </w:r>
+      <w:hyperlink r:id="rId12" w:tgtFrame="_blank" w:history="1">
         <w:r>
           <w:rPr>
             <w:rStyle w:val="Hyperlink"/>
@@ -2025,33 +1635,25 @@
         </w:rPr>
         <w:t>(</w:t>
       </w:r>
-      <w:proofErr w:type="spellStart"/>
-      <w:r>
-        <w:rPr>
-          <w:rFonts w:ascii="Times New Roman" w:hAnsi="Times New Roman" w:cs="Times New Roman"/>
-        </w:rPr>
-        <w:t>DataReportal</w:t>
-      </w:r>
-      <w:proofErr w:type="spellEnd"/>
+      <w:r>
+        <w:rPr>
+          <w:rFonts w:ascii="Times New Roman" w:hAnsi="Times New Roman" w:cs="Times New Roman"/>
+        </w:rPr>
+        <w:t xml:space="preserve">DataReportal </w:t>
+      </w:r>
+      <w:r>
+        <w:rPr>
+          <w:rFonts w:ascii="Times New Roman" w:hAnsi="Times New Roman" w:cs="Times New Roman"/>
+        </w:rPr>
+        <w:t>2026: Sri Lanka</w:t>
+      </w:r>
       <w:r>
         <w:rPr>
           <w:rFonts w:ascii="Times New Roman" w:hAnsi="Times New Roman" w:cs="Times New Roman"/>
         </w:rPr>
         <w:t xml:space="preserve"> </w:t>
       </w:r>
-      <w:r>
-        <w:rPr>
-          <w:rFonts w:ascii="Times New Roman" w:hAnsi="Times New Roman" w:cs="Times New Roman"/>
-        </w:rPr>
-        <w:t>2026: Sri Lanka</w:t>
-      </w:r>
-      <w:r>
-        <w:rPr>
-          <w:rFonts w:ascii="Times New Roman" w:hAnsi="Times New Roman" w:cs="Times New Roman"/>
-        </w:rPr>
-        <w:t xml:space="preserve"> </w:t>
-      </w:r>
-      <w:hyperlink r:id="rId12" w:history="1">
+      <w:hyperlink r:id="rId13" w:history="1">
         <w:r>
           <w:rPr>
             <w:rStyle w:val="Hyperlink"/>
@@ -2179,7 +1781,14 @@
         <w:rPr>
           <w:rFonts w:ascii="Times New Roman" w:hAnsi="Times New Roman" w:cs="Times New Roman"/>
         </w:rPr>
-        <w:t xml:space="preserve">Sri Lanka does not need to start from scratch. Instead, it can strengthen the existing early flood warning system. Several practical improvements can be made to the existing flood warning systems and practices. Even though river level data are frequently collected and maintained via the Disaster Management Center website, they are often available in unstructured formats that demand significant time and effort to convert into a form suitable for modeling. Data is the backbone of any data-driven decision-making process. There is a famous belief that 80% of a data scientist's time is spent on data cleaning. This challenge is evident in the existing databases, which require substantial effort to convert into structured datasets before they can be used for model development. Another key weakness of the current system is the reliance on outdated and fixed thresholds to detect flood conditions. As a result, Sri Lanka often experiences floods before the alerts arrive. Ideally, warnings should precede floods, not follow them. Findings from our previous case study, funded by OWSD-UNESCO, revealed that the data has significant potential to give early flood warnings ahead of actual flood incidents. But the problem is the fixed, outdated thresholds that are set too high, preventing the data from signaling risk until the disaster has already begun. For example, as shown in Figure 3, the observed water levels showed clear early warning signs through increasing trends when compared with historical patterns. However, the existing flood alert thresholds were set at a considerably higher value. </w:t>
+        <w:t xml:space="preserve">Sri Lanka does not need to start from scratch. Instead, it can strengthen the existing early flood warning system. Several practical improvements can be made to the existing flood warning </w:t>
+      </w:r>
+      <w:r>
+        <w:rPr>
+          <w:rFonts w:ascii="Times New Roman" w:hAnsi="Times New Roman" w:cs="Times New Roman"/>
+        </w:rPr>
+        <w:lastRenderedPageBreak/>
+        <w:t xml:space="preserve">systems and practices. Even though river level data are frequently collected and maintained via the Disaster Management Center website, they are often available in unstructured formats that demand significant time and effort to convert into a form suitable for modeling. Data is the backbone of any data-driven decision-making process. There is a famous belief that 80% of a data scientist's time is spent on data cleaning. This challenge is evident in the existing databases, which require substantial effort to convert into structured datasets before they can be used for model development. Another key weakness of the current system is the reliance on outdated and fixed thresholds to detect flood conditions. As a result, Sri Lanka often experiences floods before the alerts arrive. Ideally, warnings should precede floods, not follow them. Findings from our previous case study, funded by OWSD-UNESCO, revealed that the data has significant potential to give early flood warnings ahead of actual flood incidents. But the problem is the fixed, outdated thresholds that are set too high, preventing the data from signaling risk until the disaster has already begun. For example, as shown in Figure 3, the observed water levels showed clear early warning signs through increasing trends when compared with historical patterns. However, the existing flood alert thresholds were set at a considerably higher value. </w:t>
       </w:r>
       <w:r>
         <w:rPr>
@@ -2227,42 +1836,22 @@
         <w:rPr>
           <w:rFonts w:ascii="Times New Roman" w:hAnsi="Times New Roman" w:cs="Times New Roman"/>
         </w:rPr>
-        <w:t>In addition to that, these thresholds should be updated to reflect the changes in the typical behavior of the environment. In a statistical context, this is known as "</w:t>
-      </w:r>
-      <w:proofErr w:type="spellStart"/>
-      <w:r>
-        <w:rPr>
-          <w:rFonts w:ascii="Times New Roman" w:hAnsi="Times New Roman" w:cs="Times New Roman"/>
-        </w:rPr>
-        <w:t>nonstationarity</w:t>
-      </w:r>
-      <w:proofErr w:type="spellEnd"/>
-      <w:r>
-        <w:rPr>
-          <w:rFonts w:ascii="Times New Roman" w:hAnsi="Times New Roman" w:cs="Times New Roman"/>
-        </w:rPr>
-        <w:t xml:space="preserve">" in the </w:t>
-      </w:r>
-      <w:r>
-        <w:rPr>
-          <w:rFonts w:ascii="Times New Roman" w:hAnsi="Times New Roman" w:cs="Times New Roman"/>
+        <w:t>In addition to that, these thresholds should be updated to reflect the changes in the typical behavior of the environment. In a statistical context, this is known as "nonstationarity" in the data, and in a machine learning context, this concept is known as "concept drift." The typical behavior of a given system changes over time. Then our models should be updated according to the changing environment. After the economic crisis, the country experienced a significant boom in infrastructure development and construction. Climate change is another major concern that must be considered when designing an effective early flood warning system. The flood warning thresholds should be updated according to the changing environment using advanced data-driven analytical techniques. Only then can we come up with a more realistic and adaptive threshold to issue timely and effective warnings. Further, the lethargic attitude of practitioners and government agencies towards advanced statistical and AI modeling practices further limits the effectiveness of the current flood warning system.</w:t>
+      </w:r>
+    </w:p>
+    <w:p>
+      <w:pPr>
+        <w:spacing w:before="120" w:after="120"/>
+        <w:jc w:val="both"/>
+        <w:rPr>
+          <w:rFonts w:ascii="Times New Roman" w:hAnsi="Times New Roman" w:cs="Times New Roman"/>
+        </w:rPr>
+      </w:pPr>
+      <w:r>
+        <w:rPr>
+          <w:noProof/>
         </w:rPr>
         <w:lastRenderedPageBreak/>
-        <w:t>data, and in a machine learning context, this concept is known as "concept drift." The typical behavior of a given system changes over time. Then our models should be updated according to the changing environment. After the economic crisis, the country experienced a significant boom in infrastructure development and construction. Climate change is another major concern that must be considered when designing an effective early flood warning system. The flood warning thresholds should be updated according to the changing environment using advanced data-driven analytical techniques. Only then can we come up with a more realistic and adaptive threshold to issue timely and effective warnings. Further, the lethargic attitude of practitioners and government agencies towards advanced statistical and AI modeling practices further limits the effectiveness of the current flood warning system.</w:t>
-      </w:r>
-    </w:p>
-    <w:p>
-      <w:pPr>
-        <w:spacing w:before="120" w:after="120"/>
-        <w:jc w:val="both"/>
-        <w:rPr>
-          <w:rFonts w:ascii="Times New Roman" w:hAnsi="Times New Roman" w:cs="Times New Roman"/>
-        </w:rPr>
-      </w:pPr>
-      <w:r>
-        <w:rPr>
-          <w:noProof/>
-        </w:rPr>
         <w:drawing>
           <wp:anchor distT="0" distB="0" distL="114300" distR="114300" simplePos="0" relativeHeight="251668480" behindDoc="0" locked="0" layoutInCell="1" allowOverlap="1" wp14:anchorId="6C8EC256" wp14:editId="34A07CB9">
             <wp:simplePos x="0" y="0"/>
@@ -2295,7 +1884,7 @@
                     </pic:cNvPicPr>
                   </pic:nvPicPr>
                   <pic:blipFill>
-                    <a:blip r:embed="rId13">
+                    <a:blip r:embed="rId14">
                       <a:extLst>
                         <a:ext uri="{28A0092B-C50C-407E-A947-70E740481C1C}">
                           <a14:useLocalDpi xmlns:a14="http://schemas.microsoft.com/office/drawing/2010/main" val="0"/>
@@ -2568,14 +2157,7 @@
         <w:rPr>
           <w:rFonts w:ascii="Times New Roman" w:hAnsi="Times New Roman" w:cs="Times New Roman"/>
         </w:rPr>
-        <w:t xml:space="preserve">Detecting unusual observations in data is an emerging field with many different applications, including detecting events such as bushfires, earthquakes, tsunamis, air pollution, and floods, which often occur as significant deviations from typical environmental conditions. However, the unusual observation in data, commonly known as an anomaly in statistical literature, doesn’t have a unified definition, and the definition depends on the context and behavior of the data. On the other hand, anomaly detection methods are heavily influenced by the way we </w:t>
-      </w:r>
-      <w:r>
-        <w:rPr>
-          <w:rFonts w:ascii="Times New Roman" w:hAnsi="Times New Roman" w:cs="Times New Roman"/>
-        </w:rPr>
-        <w:lastRenderedPageBreak/>
-        <w:t xml:space="preserve">define an anomaly. This is where the real challenge comes, as identifying the most suitable approach from a large pool of candidate models for detecting anomalies requires proper investigation of data. Data visualization plays a critical role in this regard. Another important aspect we can consider in a river network is the relationship between upstream and downstream </w:t>
+        <w:t xml:space="preserve">Detecting unusual observations in data is an emerging field with many different applications, including detecting events such as bushfires, earthquakes, tsunamis, air pollution, and floods, which often occur as significant deviations from typical environmental conditions. However, the unusual observation in data, commonly known as an anomaly in statistical literature, doesn’t have a unified definition, and the definition depends on the context and behavior of the data. On the other hand, anomaly detection methods are heavily influenced by the way we define an anomaly. This is where the real challenge comes, as identifying the most suitable approach from a large pool of candidate models for detecting anomalies requires proper investigation of data. Data visualization plays a critical role in this regard. Another important aspect we can consider in a river network is the relationship between upstream and downstream </w:t>
       </w:r>
       <w:r>
         <w:rPr>
@@ -2610,6 +2192,7 @@
           <w:sz w:val="32"/>
           <w:szCs w:val="32"/>
         </w:rPr>
+        <w:lastRenderedPageBreak/>
         <w:t>Points of Caution</w:t>
       </w:r>
     </w:p>
@@ -2832,7 +2415,7 @@
         </w:rPr>
         <w:t xml:space="preserve"> Priyanga Dilini Talagala is a senior lecturer in the Department of Computational Mathematics, Faculty of Information Technology, University of Moratuwa, Sri Lanka. She earned her PhD in statistics and mathematics from Monash University, Australia. She is the main maintainer of the CRAN task view for anomaly detection, which provides a comprehensive list of open-source R packages for anomaly detection. Personal website: </w:t>
       </w:r>
-      <w:hyperlink r:id="rId14" w:history="1">
+      <w:hyperlink r:id="rId15" w:history="1">
         <w:r>
           <w:rPr>
             <w:rStyle w:val="Hyperlink"/>
@@ -2853,12 +2436,12 @@
       </w:r>
     </w:p>
     <w:sectPr>
-      <w:headerReference w:type="even" r:id="rId15"/>
-      <w:headerReference w:type="default" r:id="rId16"/>
-      <w:footerReference w:type="even" r:id="rId17"/>
-      <w:footerReference w:type="default" r:id="rId18"/>
-      <w:headerReference w:type="first" r:id="rId19"/>
-      <w:footerReference w:type="first" r:id="rId20"/>
+      <w:headerReference w:type="even" r:id="rId16"/>
+      <w:headerReference w:type="default" r:id="rId17"/>
+      <w:footerReference w:type="even" r:id="rId18"/>
+      <w:footerReference w:type="default" r:id="rId19"/>
+      <w:headerReference w:type="first" r:id="rId20"/>
+      <w:footerReference w:type="first" r:id="rId21"/>
       <w:pgSz w:w="11906" w:h="16838" w:code="9"/>
       <w:pgMar w:top="1440" w:right="1440" w:bottom="1440" w:left="1440" w:header="720" w:footer="720" w:gutter="0"/>
       <w:cols w:space="720"/>
@@ -4085,7 +3668,6 @@
   <w:style w:type="character" w:default="1" w:styleId="DefaultParagraphFont">
     <w:name w:val="Default Paragraph Font"/>
     <w:uiPriority w:val="1"/>
-    <w:semiHidden/>
     <w:unhideWhenUsed/>
   </w:style>
   <w:style w:type="table" w:default="1" w:styleId="TableNormal">

</xml_diff>